<commit_message>
Floating table wrapping: BothSides for centered tables + lines_beside bias fix
- Centered floating tables now use WrapText::BothSides when both sides
  have ≥72pt of space, reusing existing image wrapping infrastructure
- Tuned lines_beside bias from -0.1 to +0.3, fixing off-by-one where
  borderline text lines went full-width instead of wrapping beside the
  table (case46 Jaccard 43% → 52%)
- Fixed case46 gridCol widths to match tblW (was full page width)
- Noted tblW vs gridCol auto-fit bug in roadmap
- Removed unused bottom_from_text field from FloatZone

Co-Authored-By: Claude Opus 4.6 (1M context) <noreply@anthropic.com>
</commit_message>
<xml_diff>
--- a/tests/fixtures/cases/case46/input.docx
+++ b/tests/fixtures/cases/case46/input.docx
@@ -25,8 +25,8 @@
         </w:tblBorders>
       </w:tblPr>
       <w:tblGrid>
-        <w:gridCol w:w="4680"/>
-        <w:gridCol w:w="4680"/>
+        <w:gridCol w:w="1800"/>
+        <w:gridCol w:w="1800"/>
       </w:tblGrid>
       <w:tr>
         <w:trPr>
@@ -87,8 +87,8 @@
         </w:tblBorders>
       </w:tblPr>
       <w:tblGrid>
-        <w:gridCol w:w="4680"/>
-        <w:gridCol w:w="4680"/>
+        <w:gridCol w:w="1800"/>
+        <w:gridCol w:w="1800"/>
       </w:tblGrid>
       <w:tr>
         <w:trPr>
@@ -149,8 +149,8 @@
         </w:tblBorders>
       </w:tblPr>
       <w:tblGrid>
-        <w:gridCol w:w="4680"/>
-        <w:gridCol w:w="4680"/>
+        <w:gridCol w:w="1800"/>
+        <w:gridCol w:w="1800"/>
       </w:tblGrid>
       <w:tr>
         <w:trPr>
@@ -211,8 +211,8 @@
         </w:tblBorders>
       </w:tblPr>
       <w:tblGrid>
-        <w:gridCol w:w="4680"/>
-        <w:gridCol w:w="4680"/>
+        <w:gridCol w:w="1800"/>
+        <w:gridCol w:w="1800"/>
       </w:tblGrid>
       <w:tr>
         <w:trPr>
@@ -273,8 +273,8 @@
         </w:tblBorders>
       </w:tblPr>
       <w:tblGrid>
-        <w:gridCol w:w="4680"/>
-        <w:gridCol w:w="4680"/>
+        <w:gridCol w:w="1800"/>
+        <w:gridCol w:w="1800"/>
       </w:tblGrid>
       <w:tr>
         <w:trPr>
@@ -360,8 +360,8 @@
         </w:tblBorders>
       </w:tblPr>
       <w:tblGrid>
-        <w:gridCol w:w="4680"/>
-        <w:gridCol w:w="4680"/>
+        <w:gridCol w:w="1800"/>
+        <w:gridCol w:w="1800"/>
       </w:tblGrid>
       <w:tr>
         <w:trPr>
@@ -447,8 +447,8 @@
         </w:tblBorders>
       </w:tblPr>
       <w:tblGrid>
-        <w:gridCol w:w="4680"/>
-        <w:gridCol w:w="4680"/>
+        <w:gridCol w:w="1800"/>
+        <w:gridCol w:w="1800"/>
       </w:tblGrid>
       <w:tr>
         <w:trPr>
@@ -534,8 +534,8 @@
         </w:tblBorders>
       </w:tblPr>
       <w:tblGrid>
-        <w:gridCol w:w="4680"/>
-        <w:gridCol w:w="4680"/>
+        <w:gridCol w:w="1800"/>
+        <w:gridCol w:w="1800"/>
       </w:tblGrid>
       <w:tr>
         <w:trPr>
@@ -621,8 +621,8 @@
         </w:tblBorders>
       </w:tblPr>
       <w:tblGrid>
-        <w:gridCol w:w="4680"/>
-        <w:gridCol w:w="4680"/>
+        <w:gridCol w:w="1800"/>
+        <w:gridCol w:w="1800"/>
       </w:tblGrid>
       <w:tr>
         <w:trPr>
@@ -733,8 +733,8 @@
         </w:tblBorders>
       </w:tblPr>
       <w:tblGrid>
-        <w:gridCol w:w="4680"/>
-        <w:gridCol w:w="4680"/>
+        <w:gridCol w:w="1800"/>
+        <w:gridCol w:w="1800"/>
       </w:tblGrid>
       <w:tr>
         <w:trPr>
@@ -845,8 +845,8 @@
         </w:tblBorders>
       </w:tblPr>
       <w:tblGrid>
-        <w:gridCol w:w="4680"/>
-        <w:gridCol w:w="4680"/>
+        <w:gridCol w:w="1800"/>
+        <w:gridCol w:w="1800"/>
       </w:tblGrid>
       <w:tr>
         <w:trPr>
@@ -957,8 +957,8 @@
         </w:tblBorders>
       </w:tblPr>
       <w:tblGrid>
-        <w:gridCol w:w="4680"/>
-        <w:gridCol w:w="4680"/>
+        <w:gridCol w:w="1800"/>
+        <w:gridCol w:w="1800"/>
       </w:tblGrid>
       <w:tr>
         <w:trPr>
@@ -1069,8 +1069,8 @@
         </w:tblBorders>
       </w:tblPr>
       <w:tblGrid>
-        <w:gridCol w:w="4680"/>
-        <w:gridCol w:w="4680"/>
+        <w:gridCol w:w="1800"/>
+        <w:gridCol w:w="1800"/>
       </w:tblGrid>
       <w:tr>
         <w:tc>
@@ -1216,8 +1216,8 @@
         </w:tblBorders>
       </w:tblPr>
       <w:tblGrid>
-        <w:gridCol w:w="4680"/>
-        <w:gridCol w:w="4680"/>
+        <w:gridCol w:w="1800"/>
+        <w:gridCol w:w="1800"/>
       </w:tblGrid>
       <w:tr>
         <w:tc>

</xml_diff>